<commit_message>
Add a tag index, NRC logo, new résumé, and Pi Boy fixes
Tags across the site are now links: hovering lifts and tints them, and
clicking opens tags.html filtered to that tag. The index carries all 41
tags with counts and the 11 listed projects, each card declaring the
union of the tags shown on its detail page, its card, and the homepage —
so every tag link resolves to a real result. Filtering is by URL hash, so
a filtered view is linkable.

NUS Netball Recreational Club gets its actual crest, replacing the
monogram. Résumé replaced with the copy from Downloads.

Pi Boy: Python and Google marks beside the tools, "Setup:" dropped,
Shared Calendar and Telegram Bot capitalised, and the section headings
moved off the display serif — it read too light at that size — onto
semibold sans, so "Getting it running" and "Setting up the bot" match.

Co-Authored-By: Claude Opus 5 <noreply@anthropic.com>
</commit_message>
<xml_diff>
--- a/Niik_Seah_Resume.docx
+++ b/Niik_Seah_Resume.docx
@@ -1,6 +1,6 @@
 
 <file path=word/document.xml><?xml version="1.0" encoding="utf-8"?>
-<w:document xmlns:wpc="http://schemas.microsoft.com/office/word/2010/wordprocessingCanvas" xmlns:cx="http://schemas.microsoft.com/office/drawing/2014/chartex" xmlns:cx1="http://schemas.microsoft.com/office/drawing/2015/9/8/chartex" xmlns:cx2="http://schemas.microsoft.com/office/drawing/2015/10/21/chartex" xmlns:cx3="http://schemas.microsoft.com/office/drawing/2016/5/9/chartex" xmlns:cx4="http://schemas.microsoft.com/office/drawing/2016/5/10/chartex" xmlns:cx5="http://schemas.microsoft.com/office/drawing/2016/5/11/chartex" xmlns:cx6="http://schemas.microsoft.com/office/drawing/2016/5/12/chartex" xmlns:cx7="http://schemas.microsoft.com/office/drawing/2016/5/13/chartex" xmlns:cx8="http://schemas.microsoft.com/office/drawing/2016/5/14/chartex" xmlns:mc="http://schemas.openxmlformats.org/markup-compatibility/2006" xmlns:m="http://schemas.openxmlformats.org/officeDocument/2006/math" xmlns:aink="http://schemas.microsoft.com/office/drawing/2016/ink" xmlns:am3d="http://schemas.microsoft.com/office/drawing/2017/model3d" xmlns:oel="http://schemas.microsoft.com/office/2019/extlst" xmlns:r="http://schemas.openxmlformats.org/officeDocument/2006/relationships" xmlns:wp14="http://schemas.microsoft.com/office/word/2010/wordprocessingDrawing" xmlns:wp="http://schemas.openxmlformats.org/drawingml/2006/wordprocessingDrawing" xmlns:wpg="http://schemas.microsoft.com/office/word/2010/wordprocessingGroup" xmlns:wpi="http://schemas.microsoft.com/office/word/2010/wordprocessingInk" xmlns:wps="http://schemas.microsoft.com/office/word/2010/wordprocessingShape" xmlns:o="urn:schemas-microsoft-com:office:office" xmlns:v="urn:schemas-microsoft-com:vml" xmlns:w10="urn:schemas-microsoft-com:office:word" xmlns:w="http://schemas.openxmlformats.org/wordprocessingml/2006/main" xmlns:w14="http://schemas.microsoft.com/office/word/2010/wordml" xmlns:w15="http://schemas.microsoft.com/office/word/2012/wordml" xmlns:w16cei="http://schemas.microsoft.com/office/word/2026/wordml/cei" xmlns:w16cex="http://schemas.microsoft.com/office/word/2018/wordml/cex" xmlns:w16cid="http://schemas.microsoft.com/office/word/2016/wordml/cid" xmlns:w16="http://schemas.microsoft.com/office/word/2018/wordml" xmlns:w16sdtdh="http://schemas.microsoft.com/office/word/2020/wordml/sdtdatahash" xmlns:w16sdtfl="http://schemas.microsoft.com/office/word/2024/wordml/sdtformatlock" xmlns:w16se="http://schemas.microsoft.com/office/word/2015/wordml/symex" xmlns:w16du="http://schemas.microsoft.com/office/word/2023/wordml/word16du" xmlns:wne="http://schemas.microsoft.com/office/word/2006/wordml" mc:Ignorable="w14 w15 w16se w16cid w16 w16cex w16sdtdh w16sdtfl w16du wp14">
+<w:document xmlns:wpc="http://schemas.microsoft.com/office/word/2010/wordprocessingCanvas" xmlns:cx="http://schemas.microsoft.com/office/drawing/2014/chartex" xmlns:cx1="http://schemas.microsoft.com/office/drawing/2015/9/8/chartex" xmlns:cx2="http://schemas.microsoft.com/office/drawing/2015/10/21/chartex" xmlns:cx3="http://schemas.microsoft.com/office/drawing/2016/5/9/chartex" xmlns:cx4="http://schemas.microsoft.com/office/drawing/2016/5/10/chartex" xmlns:cx5="http://schemas.microsoft.com/office/drawing/2016/5/11/chartex" xmlns:cx6="http://schemas.microsoft.com/office/drawing/2016/5/12/chartex" xmlns:cx7="http://schemas.microsoft.com/office/drawing/2016/5/13/chartex" xmlns:cx8="http://schemas.microsoft.com/office/drawing/2016/5/14/chartex" xmlns:mc="http://schemas.openxmlformats.org/markup-compatibility/2006" xmlns:m="http://schemas.openxmlformats.org/officeDocument/2006/math" xmlns:aink="http://schemas.microsoft.com/office/drawing/2016/ink" xmlns:am3d="http://schemas.microsoft.com/office/drawing/2017/model3d" xmlns:oel="http://schemas.microsoft.com/office/2019/extlst" xmlns:r="http://schemas.openxmlformats.org/officeDocument/2006/relationships" xmlns:wp14="http://schemas.microsoft.com/office/word/2010/wordprocessingDrawing" xmlns:wp="http://schemas.openxmlformats.org/drawingml/2006/wordprocessingDrawing" xmlns:wpg="http://schemas.microsoft.com/office/word/2010/wordprocessingGroup" xmlns:wpi="http://schemas.microsoft.com/office/word/2010/wordprocessingInk" xmlns:wps="http://schemas.microsoft.com/office/word/2010/wordprocessingShape" xmlns:o="urn:schemas-microsoft-com:office:office" xmlns:v="urn:schemas-microsoft-com:vml" xmlns:w10="urn:schemas-microsoft-com:office:word" xmlns:w="http://schemas.openxmlformats.org/wordprocessingml/2006/main" xmlns:w14="http://schemas.microsoft.com/office/word/2010/wordml" xmlns:w15="http://schemas.microsoft.com/office/word/2012/wordml" xmlns:w16cex="http://schemas.microsoft.com/office/word/2018/wordml/cex" xmlns:w16cid="http://schemas.microsoft.com/office/word/2016/wordml/cid" xmlns:w16="http://schemas.microsoft.com/office/word/2018/wordml" xmlns:w16sdtdh="http://schemas.microsoft.com/office/word/2020/wordml/sdtdatahash" xmlns:w16sdtfl="http://schemas.microsoft.com/office/word/2024/wordml/sdtformatlock" xmlns:w16se="http://schemas.microsoft.com/office/word/2015/wordml/symex" xmlns:w16du="http://schemas.microsoft.com/office/word/2023/wordml/word16du" xmlns:wne="http://schemas.microsoft.com/office/word/2006/wordml" mc:Ignorable="w14 w15 w16se w16cid w16 w16cex w16sdtdh w16sdtfl w16du wp14">
   <w:body>
     <w:p>
       <w:pPr>
@@ -2009,6 +2009,24 @@
           <w:szCs w:val="22"/>
         </w:rPr>
         <w:t xml:space="preserve">Interests: </w:t>
+      </w:r>
+      <w:r>
+        <w:rPr>
+          <w:rFonts w:ascii="Times New Roman" w:eastAsia="Times New Roman" w:hAnsi="Times New Roman" w:cs="Times New Roman"/>
+          <w:bCs/>
+          <w:sz w:val="22"/>
+          <w:szCs w:val="22"/>
+        </w:rPr>
+        <w:t>Product,</w:t>
+      </w:r>
+      <w:r>
+        <w:rPr>
+          <w:rFonts w:ascii="Times New Roman" w:eastAsia="Times New Roman" w:hAnsi="Times New Roman" w:cs="Times New Roman"/>
+          <w:b/>
+          <w:sz w:val="22"/>
+          <w:szCs w:val="22"/>
+        </w:rPr>
+        <w:t xml:space="preserve"> </w:t>
       </w:r>
       <w:r>
         <w:rPr>
@@ -2031,7 +2049,7 @@
 </file>
 
 <file path=word/endnotes.xml><?xml version="1.0" encoding="utf-8"?>
-<w:endnotes xmlns:wpc="http://schemas.microsoft.com/office/word/2010/wordprocessingCanvas" xmlns:cx="http://schemas.microsoft.com/office/drawing/2014/chartex" xmlns:cx1="http://schemas.microsoft.com/office/drawing/2015/9/8/chartex" xmlns:cx2="http://schemas.microsoft.com/office/drawing/2015/10/21/chartex" xmlns:cx3="http://schemas.microsoft.com/office/drawing/2016/5/9/chartex" xmlns:cx4="http://schemas.microsoft.com/office/drawing/2016/5/10/chartex" xmlns:cx5="http://schemas.microsoft.com/office/drawing/2016/5/11/chartex" xmlns:cx6="http://schemas.microsoft.com/office/drawing/2016/5/12/chartex" xmlns:cx7="http://schemas.microsoft.com/office/drawing/2016/5/13/chartex" xmlns:cx8="http://schemas.microsoft.com/office/drawing/2016/5/14/chartex" xmlns:mc="http://schemas.openxmlformats.org/markup-compatibility/2006" xmlns:m="http://schemas.openxmlformats.org/officeDocument/2006/math" xmlns:aink="http://schemas.microsoft.com/office/drawing/2016/ink" xmlns:am3d="http://schemas.microsoft.com/office/drawing/2017/model3d" xmlns:oel="http://schemas.microsoft.com/office/2019/extlst" xmlns:r="http://schemas.openxmlformats.org/officeDocument/2006/relationships" xmlns:wp14="http://schemas.microsoft.com/office/word/2010/wordprocessingDrawing" xmlns:wp="http://schemas.openxmlformats.org/drawingml/2006/wordprocessingDrawing" xmlns:wpg="http://schemas.microsoft.com/office/word/2010/wordprocessingGroup" xmlns:wpi="http://schemas.microsoft.com/office/word/2010/wordprocessingInk" xmlns:wps="http://schemas.microsoft.com/office/word/2010/wordprocessingShape" xmlns:o="urn:schemas-microsoft-com:office:office" xmlns:v="urn:schemas-microsoft-com:vml" xmlns:w10="urn:schemas-microsoft-com:office:word" xmlns:w="http://schemas.openxmlformats.org/wordprocessingml/2006/main" xmlns:w14="http://schemas.microsoft.com/office/word/2010/wordml" xmlns:w15="http://schemas.microsoft.com/office/word/2012/wordml" xmlns:w16cei="http://schemas.microsoft.com/office/word/2026/wordml/cei" xmlns:w16cex="http://schemas.microsoft.com/office/word/2018/wordml/cex" xmlns:w16cid="http://schemas.microsoft.com/office/word/2016/wordml/cid" xmlns:w16="http://schemas.microsoft.com/office/word/2018/wordml" xmlns:w16sdtdh="http://schemas.microsoft.com/office/word/2020/wordml/sdtdatahash" xmlns:w16sdtfl="http://schemas.microsoft.com/office/word/2024/wordml/sdtformatlock" xmlns:w16se="http://schemas.microsoft.com/office/word/2015/wordml/symex" xmlns:w16du="http://schemas.microsoft.com/office/word/2023/wordml/word16du" xmlns:wne="http://schemas.microsoft.com/office/word/2006/wordml" mc:Ignorable="w14 w15 w16se w16cid w16 w16cex w16sdtdh w16sdtfl w16du wp14">
+<w:endnotes xmlns:wpc="http://schemas.microsoft.com/office/word/2010/wordprocessingCanvas" xmlns:cx="http://schemas.microsoft.com/office/drawing/2014/chartex" xmlns:cx1="http://schemas.microsoft.com/office/drawing/2015/9/8/chartex" xmlns:cx2="http://schemas.microsoft.com/office/drawing/2015/10/21/chartex" xmlns:cx3="http://schemas.microsoft.com/office/drawing/2016/5/9/chartex" xmlns:cx4="http://schemas.microsoft.com/office/drawing/2016/5/10/chartex" xmlns:cx5="http://schemas.microsoft.com/office/drawing/2016/5/11/chartex" xmlns:cx6="http://schemas.microsoft.com/office/drawing/2016/5/12/chartex" xmlns:cx7="http://schemas.microsoft.com/office/drawing/2016/5/13/chartex" xmlns:cx8="http://schemas.microsoft.com/office/drawing/2016/5/14/chartex" xmlns:mc="http://schemas.openxmlformats.org/markup-compatibility/2006" xmlns:m="http://schemas.openxmlformats.org/officeDocument/2006/math" xmlns:aink="http://schemas.microsoft.com/office/drawing/2016/ink" xmlns:am3d="http://schemas.microsoft.com/office/drawing/2017/model3d" xmlns:oel="http://schemas.microsoft.com/office/2019/extlst" xmlns:r="http://schemas.openxmlformats.org/officeDocument/2006/relationships" xmlns:wp14="http://schemas.microsoft.com/office/word/2010/wordprocessingDrawing" xmlns:wp="http://schemas.openxmlformats.org/drawingml/2006/wordprocessingDrawing" xmlns:wpg="http://schemas.microsoft.com/office/word/2010/wordprocessingGroup" xmlns:wpi="http://schemas.microsoft.com/office/word/2010/wordprocessingInk" xmlns:wps="http://schemas.microsoft.com/office/word/2010/wordprocessingShape" xmlns:o="urn:schemas-microsoft-com:office:office" xmlns:v="urn:schemas-microsoft-com:vml" xmlns:w10="urn:schemas-microsoft-com:office:word" xmlns:w="http://schemas.openxmlformats.org/wordprocessingml/2006/main" xmlns:w14="http://schemas.microsoft.com/office/word/2010/wordml" xmlns:w15="http://schemas.microsoft.com/office/word/2012/wordml" xmlns:w16cex="http://schemas.microsoft.com/office/word/2018/wordml/cex" xmlns:w16cid="http://schemas.microsoft.com/office/word/2016/wordml/cid" xmlns:w16="http://schemas.microsoft.com/office/word/2018/wordml" xmlns:w16sdtdh="http://schemas.microsoft.com/office/word/2020/wordml/sdtdatahash" xmlns:w16sdtfl="http://schemas.microsoft.com/office/word/2024/wordml/sdtformatlock" xmlns:w16se="http://schemas.microsoft.com/office/word/2015/wordml/symex" xmlns:w16du="http://schemas.microsoft.com/office/word/2023/wordml/word16du" xmlns:wne="http://schemas.microsoft.com/office/word/2006/wordml" mc:Ignorable="w14 w15 w16se w16cid w16 w16cex w16sdtdh w16sdtfl w16du wp14">
   <w:endnote w:type="separator" w:id="-1">
     <w:p>
       <w:r>
@@ -2050,7 +2068,7 @@
 </file>
 
 <file path=word/footnotes.xml><?xml version="1.0" encoding="utf-8"?>
-<w:footnotes xmlns:wpc="http://schemas.microsoft.com/office/word/2010/wordprocessingCanvas" xmlns:cx="http://schemas.microsoft.com/office/drawing/2014/chartex" xmlns:cx1="http://schemas.microsoft.com/office/drawing/2015/9/8/chartex" xmlns:cx2="http://schemas.microsoft.com/office/drawing/2015/10/21/chartex" xmlns:cx3="http://schemas.microsoft.com/office/drawing/2016/5/9/chartex" xmlns:cx4="http://schemas.microsoft.com/office/drawing/2016/5/10/chartex" xmlns:cx5="http://schemas.microsoft.com/office/drawing/2016/5/11/chartex" xmlns:cx6="http://schemas.microsoft.com/office/drawing/2016/5/12/chartex" xmlns:cx7="http://schemas.microsoft.com/office/drawing/2016/5/13/chartex" xmlns:cx8="http://schemas.microsoft.com/office/drawing/2016/5/14/chartex" xmlns:mc="http://schemas.openxmlformats.org/markup-compatibility/2006" xmlns:m="http://schemas.openxmlformats.org/officeDocument/2006/math" xmlns:aink="http://schemas.microsoft.com/office/drawing/2016/ink" xmlns:am3d="http://schemas.microsoft.com/office/drawing/2017/model3d" xmlns:oel="http://schemas.microsoft.com/office/2019/extlst" xmlns:r="http://schemas.openxmlformats.org/officeDocument/2006/relationships" xmlns:wp14="http://schemas.microsoft.com/office/word/2010/wordprocessingDrawing" xmlns:wp="http://schemas.openxmlformats.org/drawingml/2006/wordprocessingDrawing" xmlns:wpg="http://schemas.microsoft.com/office/word/2010/wordprocessingGroup" xmlns:wpi="http://schemas.microsoft.com/office/word/2010/wordprocessingInk" xmlns:wps="http://schemas.microsoft.com/office/word/2010/wordprocessingShape" xmlns:o="urn:schemas-microsoft-com:office:office" xmlns:v="urn:schemas-microsoft-com:vml" xmlns:w10="urn:schemas-microsoft-com:office:word" xmlns:w="http://schemas.openxmlformats.org/wordprocessingml/2006/main" xmlns:w14="http://schemas.microsoft.com/office/word/2010/wordml" xmlns:w15="http://schemas.microsoft.com/office/word/2012/wordml" xmlns:w16cei="http://schemas.microsoft.com/office/word/2026/wordml/cei" xmlns:w16cex="http://schemas.microsoft.com/office/word/2018/wordml/cex" xmlns:w16cid="http://schemas.microsoft.com/office/word/2016/wordml/cid" xmlns:w16="http://schemas.microsoft.com/office/word/2018/wordml" xmlns:w16sdtdh="http://schemas.microsoft.com/office/word/2020/wordml/sdtdatahash" xmlns:w16sdtfl="http://schemas.microsoft.com/office/word/2024/wordml/sdtformatlock" xmlns:w16se="http://schemas.microsoft.com/office/word/2015/wordml/symex" xmlns:w16du="http://schemas.microsoft.com/office/word/2023/wordml/word16du" xmlns:wne="http://schemas.microsoft.com/office/word/2006/wordml" mc:Ignorable="w14 w15 w16se w16cid w16 w16cex w16sdtdh w16sdtfl w16du wp14">
+<w:footnotes xmlns:wpc="http://schemas.microsoft.com/office/word/2010/wordprocessingCanvas" xmlns:cx="http://schemas.microsoft.com/office/drawing/2014/chartex" xmlns:cx1="http://schemas.microsoft.com/office/drawing/2015/9/8/chartex" xmlns:cx2="http://schemas.microsoft.com/office/drawing/2015/10/21/chartex" xmlns:cx3="http://schemas.microsoft.com/office/drawing/2016/5/9/chartex" xmlns:cx4="http://schemas.microsoft.com/office/drawing/2016/5/10/chartex" xmlns:cx5="http://schemas.microsoft.com/office/drawing/2016/5/11/chartex" xmlns:cx6="http://schemas.microsoft.com/office/drawing/2016/5/12/chartex" xmlns:cx7="http://schemas.microsoft.com/office/drawing/2016/5/13/chartex" xmlns:cx8="http://schemas.microsoft.com/office/drawing/2016/5/14/chartex" xmlns:mc="http://schemas.openxmlformats.org/markup-compatibility/2006" xmlns:m="http://schemas.openxmlformats.org/officeDocument/2006/math" xmlns:aink="http://schemas.microsoft.com/office/drawing/2016/ink" xmlns:am3d="http://schemas.microsoft.com/office/drawing/2017/model3d" xmlns:oel="http://schemas.microsoft.com/office/2019/extlst" xmlns:r="http://schemas.openxmlformats.org/officeDocument/2006/relationships" xmlns:wp14="http://schemas.microsoft.com/office/word/2010/wordprocessingDrawing" xmlns:wp="http://schemas.openxmlformats.org/drawingml/2006/wordprocessingDrawing" xmlns:wpg="http://schemas.microsoft.com/office/word/2010/wordprocessingGroup" xmlns:wpi="http://schemas.microsoft.com/office/word/2010/wordprocessingInk" xmlns:wps="http://schemas.microsoft.com/office/word/2010/wordprocessingShape" xmlns:o="urn:schemas-microsoft-com:office:office" xmlns:v="urn:schemas-microsoft-com:vml" xmlns:w10="urn:schemas-microsoft-com:office:word" xmlns:w="http://schemas.openxmlformats.org/wordprocessingml/2006/main" xmlns:w14="http://schemas.microsoft.com/office/word/2010/wordml" xmlns:w15="http://schemas.microsoft.com/office/word/2012/wordml" xmlns:w16cex="http://schemas.microsoft.com/office/word/2018/wordml/cex" xmlns:w16cid="http://schemas.microsoft.com/office/word/2016/wordml/cid" xmlns:w16="http://schemas.microsoft.com/office/word/2018/wordml" xmlns:w16sdtdh="http://schemas.microsoft.com/office/word/2020/wordml/sdtdatahash" xmlns:w16sdtfl="http://schemas.microsoft.com/office/word/2024/wordml/sdtformatlock" xmlns:w16se="http://schemas.microsoft.com/office/word/2015/wordml/symex" xmlns:w16du="http://schemas.microsoft.com/office/word/2023/wordml/word16du" xmlns:wne="http://schemas.microsoft.com/office/word/2006/wordml" mc:Ignorable="w14 w15 w16se w16cid w16 w16cex w16sdtdh w16sdtfl w16du wp14">
   <w:footnote w:type="separator" w:id="-1">
     <w:p>
       <w:r>
@@ -2069,13 +2087,13 @@
 </file>
 
 <file path=word/header1.xml><?xml version="1.0" encoding="utf-8"?>
-<w:hdr xmlns:wpc="http://schemas.microsoft.com/office/word/2010/wordprocessingCanvas" xmlns:cx="http://schemas.microsoft.com/office/drawing/2014/chartex" xmlns:cx1="http://schemas.microsoft.com/office/drawing/2015/9/8/chartex" xmlns:cx2="http://schemas.microsoft.com/office/drawing/2015/10/21/chartex" xmlns:cx3="http://schemas.microsoft.com/office/drawing/2016/5/9/chartex" xmlns:cx4="http://schemas.microsoft.com/office/drawing/2016/5/10/chartex" xmlns:cx5="http://schemas.microsoft.com/office/drawing/2016/5/11/chartex" xmlns:cx6="http://schemas.microsoft.com/office/drawing/2016/5/12/chartex" xmlns:cx7="http://schemas.microsoft.com/office/drawing/2016/5/13/chartex" xmlns:cx8="http://schemas.microsoft.com/office/drawing/2016/5/14/chartex" xmlns:mc="http://schemas.openxmlformats.org/markup-compatibility/2006" xmlns:m="http://schemas.openxmlformats.org/officeDocument/2006/math" xmlns:aink="http://schemas.microsoft.com/office/drawing/2016/ink" xmlns:am3d="http://schemas.microsoft.com/office/drawing/2017/model3d" xmlns:oel="http://schemas.microsoft.com/office/2019/extlst" xmlns:r="http://schemas.openxmlformats.org/officeDocument/2006/relationships" xmlns:wp14="http://schemas.microsoft.com/office/word/2010/wordprocessingDrawing" xmlns:wp="http://schemas.openxmlformats.org/drawingml/2006/wordprocessingDrawing" xmlns:wpg="http://schemas.microsoft.com/office/word/2010/wordprocessingGroup" xmlns:wpi="http://schemas.microsoft.com/office/word/2010/wordprocessingInk" xmlns:wps="http://schemas.microsoft.com/office/word/2010/wordprocessingShape" xmlns:o="urn:schemas-microsoft-com:office:office" xmlns:v="urn:schemas-microsoft-com:vml" xmlns:w10="urn:schemas-microsoft-com:office:word" xmlns:w="http://schemas.openxmlformats.org/wordprocessingml/2006/main" xmlns:w14="http://schemas.microsoft.com/office/word/2010/wordml" xmlns:w15="http://schemas.microsoft.com/office/word/2012/wordml" xmlns:w16cei="http://schemas.microsoft.com/office/word/2026/wordml/cei" xmlns:w16cex="http://schemas.microsoft.com/office/word/2018/wordml/cex" xmlns:w16cid="http://schemas.microsoft.com/office/word/2016/wordml/cid" xmlns:w16="http://schemas.microsoft.com/office/word/2018/wordml" xmlns:w16sdtdh="http://schemas.microsoft.com/office/word/2020/wordml/sdtdatahash" xmlns:w16sdtfl="http://schemas.microsoft.com/office/word/2024/wordml/sdtformatlock" xmlns:w16se="http://schemas.microsoft.com/office/word/2015/wordml/symex" xmlns:w16du="http://schemas.microsoft.com/office/word/2023/wordml/word16du" xmlns:wne="http://schemas.microsoft.com/office/word/2006/wordml" mc:Ignorable="w14 w15 w16se w16cid w16 w16cex w16sdtdh w16sdtfl w16du wp14">
+<w:hdr xmlns:wpc="http://schemas.microsoft.com/office/word/2010/wordprocessingCanvas" xmlns:cx="http://schemas.microsoft.com/office/drawing/2014/chartex" xmlns:cx1="http://schemas.microsoft.com/office/drawing/2015/9/8/chartex" xmlns:cx2="http://schemas.microsoft.com/office/drawing/2015/10/21/chartex" xmlns:cx3="http://schemas.microsoft.com/office/drawing/2016/5/9/chartex" xmlns:cx4="http://schemas.microsoft.com/office/drawing/2016/5/10/chartex" xmlns:cx5="http://schemas.microsoft.com/office/drawing/2016/5/11/chartex" xmlns:cx6="http://schemas.microsoft.com/office/drawing/2016/5/12/chartex" xmlns:cx7="http://schemas.microsoft.com/office/drawing/2016/5/13/chartex" xmlns:cx8="http://schemas.microsoft.com/office/drawing/2016/5/14/chartex" xmlns:mc="http://schemas.openxmlformats.org/markup-compatibility/2006" xmlns:m="http://schemas.openxmlformats.org/officeDocument/2006/math" xmlns:aink="http://schemas.microsoft.com/office/drawing/2016/ink" xmlns:am3d="http://schemas.microsoft.com/office/drawing/2017/model3d" xmlns:oel="http://schemas.microsoft.com/office/2019/extlst" xmlns:r="http://schemas.openxmlformats.org/officeDocument/2006/relationships" xmlns:wp14="http://schemas.microsoft.com/office/word/2010/wordprocessingDrawing" xmlns:wp="http://schemas.openxmlformats.org/drawingml/2006/wordprocessingDrawing" xmlns:wpg="http://schemas.microsoft.com/office/word/2010/wordprocessingGroup" xmlns:wpi="http://schemas.microsoft.com/office/word/2010/wordprocessingInk" xmlns:wps="http://schemas.microsoft.com/office/word/2010/wordprocessingShape" xmlns:o="urn:schemas-microsoft-com:office:office" xmlns:v="urn:schemas-microsoft-com:vml" xmlns:w10="urn:schemas-microsoft-com:office:word" xmlns:w="http://schemas.openxmlformats.org/wordprocessingml/2006/main" xmlns:w14="http://schemas.microsoft.com/office/word/2010/wordml" xmlns:w15="http://schemas.microsoft.com/office/word/2012/wordml" xmlns:w16cex="http://schemas.microsoft.com/office/word/2018/wordml/cex" xmlns:w16cid="http://schemas.microsoft.com/office/word/2016/wordml/cid" xmlns:w16="http://schemas.microsoft.com/office/word/2018/wordml" xmlns:w16sdtdh="http://schemas.microsoft.com/office/word/2020/wordml/sdtdatahash" xmlns:w16sdtfl="http://schemas.microsoft.com/office/word/2024/wordml/sdtformatlock" xmlns:w16se="http://schemas.microsoft.com/office/word/2015/wordml/symex" xmlns:w16du="http://schemas.microsoft.com/office/word/2023/wordml/word16du" xmlns:wne="http://schemas.microsoft.com/office/word/2006/wordml" mc:Ignorable="w14 w15 w16se w16cid w16 w16cex w16sdtdh w16sdtfl w16du wp14">
   <w:p/>
 </w:hdr>
 </file>
 
 <file path=word/numbering.xml><?xml version="1.0" encoding="utf-8"?>
-<w:numbering xmlns:wpc="http://schemas.microsoft.com/office/word/2010/wordprocessingCanvas" xmlns:cx="http://schemas.microsoft.com/office/drawing/2014/chartex" xmlns:cx1="http://schemas.microsoft.com/office/drawing/2015/9/8/chartex" xmlns:cx2="http://schemas.microsoft.com/office/drawing/2015/10/21/chartex" xmlns:cx3="http://schemas.microsoft.com/office/drawing/2016/5/9/chartex" xmlns:cx4="http://schemas.microsoft.com/office/drawing/2016/5/10/chartex" xmlns:cx5="http://schemas.microsoft.com/office/drawing/2016/5/11/chartex" xmlns:cx6="http://schemas.microsoft.com/office/drawing/2016/5/12/chartex" xmlns:cx7="http://schemas.microsoft.com/office/drawing/2016/5/13/chartex" xmlns:cx8="http://schemas.microsoft.com/office/drawing/2016/5/14/chartex" xmlns:mc="http://schemas.openxmlformats.org/markup-compatibility/2006" xmlns:m="http://schemas.openxmlformats.org/officeDocument/2006/math" xmlns:aink="http://schemas.microsoft.com/office/drawing/2016/ink" xmlns:am3d="http://schemas.microsoft.com/office/drawing/2017/model3d" xmlns:oel="http://schemas.microsoft.com/office/2019/extlst" xmlns:r="http://schemas.openxmlformats.org/officeDocument/2006/relationships" xmlns:wp14="http://schemas.microsoft.com/office/word/2010/wordprocessingDrawing" xmlns:wp="http://schemas.openxmlformats.org/drawingml/2006/wordprocessingDrawing" xmlns:wpg="http://schemas.microsoft.com/office/word/2010/wordprocessingGroup" xmlns:wpi="http://schemas.microsoft.com/office/word/2010/wordprocessingInk" xmlns:wps="http://schemas.microsoft.com/office/word/2010/wordprocessingShape" xmlns:o="urn:schemas-microsoft-com:office:office" xmlns:v="urn:schemas-microsoft-com:vml" xmlns:w10="urn:schemas-microsoft-com:office:word" xmlns:w="http://schemas.openxmlformats.org/wordprocessingml/2006/main" xmlns:w14="http://schemas.microsoft.com/office/word/2010/wordml" xmlns:w15="http://schemas.microsoft.com/office/word/2012/wordml" xmlns:w16cei="http://schemas.microsoft.com/office/word/2026/wordml/cei" xmlns:w16cex="http://schemas.microsoft.com/office/word/2018/wordml/cex" xmlns:w16cid="http://schemas.microsoft.com/office/word/2016/wordml/cid" xmlns:w16="http://schemas.microsoft.com/office/word/2018/wordml" xmlns:w16sdtdh="http://schemas.microsoft.com/office/word/2020/wordml/sdtdatahash" xmlns:w16sdtfl="http://schemas.microsoft.com/office/word/2024/wordml/sdtformatlock" xmlns:w16se="http://schemas.microsoft.com/office/word/2015/wordml/symex" xmlns:w16du="http://schemas.microsoft.com/office/word/2023/wordml/word16du" xmlns:wne="http://schemas.microsoft.com/office/word/2006/wordml" mc:Ignorable="w14 w15 w16se w16cid w16 w16cex w16sdtdh w16sdtfl w16du wp14">
+<w:numbering xmlns:wpc="http://schemas.microsoft.com/office/word/2010/wordprocessingCanvas" xmlns:cx="http://schemas.microsoft.com/office/drawing/2014/chartex" xmlns:cx1="http://schemas.microsoft.com/office/drawing/2015/9/8/chartex" xmlns:cx2="http://schemas.microsoft.com/office/drawing/2015/10/21/chartex" xmlns:cx3="http://schemas.microsoft.com/office/drawing/2016/5/9/chartex" xmlns:cx4="http://schemas.microsoft.com/office/drawing/2016/5/10/chartex" xmlns:cx5="http://schemas.microsoft.com/office/drawing/2016/5/11/chartex" xmlns:cx6="http://schemas.microsoft.com/office/drawing/2016/5/12/chartex" xmlns:cx7="http://schemas.microsoft.com/office/drawing/2016/5/13/chartex" xmlns:cx8="http://schemas.microsoft.com/office/drawing/2016/5/14/chartex" xmlns:mc="http://schemas.openxmlformats.org/markup-compatibility/2006" xmlns:m="http://schemas.openxmlformats.org/officeDocument/2006/math" xmlns:aink="http://schemas.microsoft.com/office/drawing/2016/ink" xmlns:am3d="http://schemas.microsoft.com/office/drawing/2017/model3d" xmlns:oel="http://schemas.microsoft.com/office/2019/extlst" xmlns:r="http://schemas.openxmlformats.org/officeDocument/2006/relationships" xmlns:wp14="http://schemas.microsoft.com/office/word/2010/wordprocessingDrawing" xmlns:wp="http://schemas.openxmlformats.org/drawingml/2006/wordprocessingDrawing" xmlns:wpg="http://schemas.microsoft.com/office/word/2010/wordprocessingGroup" xmlns:wpi="http://schemas.microsoft.com/office/word/2010/wordprocessingInk" xmlns:wps="http://schemas.microsoft.com/office/word/2010/wordprocessingShape" xmlns:o="urn:schemas-microsoft-com:office:office" xmlns:v="urn:schemas-microsoft-com:vml" xmlns:w10="urn:schemas-microsoft-com:office:word" xmlns:w="http://schemas.openxmlformats.org/wordprocessingml/2006/main" xmlns:w14="http://schemas.microsoft.com/office/word/2010/wordml" xmlns:w15="http://schemas.microsoft.com/office/word/2012/wordml" xmlns:w16cex="http://schemas.microsoft.com/office/word/2018/wordml/cex" xmlns:w16cid="http://schemas.microsoft.com/office/word/2016/wordml/cid" xmlns:w16="http://schemas.microsoft.com/office/word/2018/wordml" xmlns:w16sdtdh="http://schemas.microsoft.com/office/word/2020/wordml/sdtdatahash" xmlns:w16sdtfl="http://schemas.microsoft.com/office/word/2024/wordml/sdtformatlock" xmlns:w16se="http://schemas.microsoft.com/office/word/2015/wordml/symex" xmlns:w16du="http://schemas.microsoft.com/office/word/2023/wordml/word16du" xmlns:wne="http://schemas.microsoft.com/office/word/2006/wordml" mc:Ignorable="w14 w15 w16se w16cid w16 w16cex w16sdtdh w16sdtfl w16du wp14">
   <w:abstractNum w:abstractNumId="0" w15:restartNumberingAfterBreak="0">
     <w:nsid w:val="152C62AB"/>
     <w:multiLevelType w:val="multilevel"/>

</xml_diff>